<commit_message>
v1.4.0: SETUP 网络管理界面 + shell wifi connect + 模拟器音频同步 + AudioGuard 归档
</commit_message>
<xml_diff>
--- a/docs/硬件采购清单.docx
+++ b/docs/硬件采购清单.docx
@@ -17,7 +17,7 @@
         <w:jc w:val="center"/>
       </w:pPr>
       <w:r>
-        <w:t>版本 2026-10-03（v2）· 与尺寸手册、引脚定版对齐</w:t>
+        <w:t>版本 2026-10-10（v4，对齐 BOM v3 + 预算 200 内 + 焊坏备件）· 与尺寸手册、引脚定版对齐</w:t>
       </w:r>
     </w:p>
     <w:p>
@@ -459,7 +459,7 @@
                 <w:b w:val="0"/>
                 <w:sz w:val="21"/>
               </w:rPr>
-              <w:t>¥30</w:t>
+              <w:t>¥28</w:t>
             </w:r>
           </w:p>
         </w:tc>
@@ -479,7 +479,7 @@
                 <w:b w:val="0"/>
                 <w:sz w:val="21"/>
               </w:rPr>
-              <w:t>¥30</w:t>
+              <w:t>¥28</w:t>
             </w:r>
           </w:p>
         </w:tc>
@@ -711,7 +711,7 @@
                 <w:b w:val="0"/>
                 <w:sz w:val="21"/>
               </w:rPr>
-              <w:t>6×6×2.5mm 轻触开关（直插立式，行程 0.25mm）</w:t>
+              <w:t>6×6×2.5mm 轻触开关（直插立式，行程 0.25mm）（60 上板 + 40 试错备用）</w:t>
             </w:r>
           </w:p>
         </w:tc>
@@ -731,7 +731,7 @@
                 <w:b w:val="0"/>
                 <w:sz w:val="21"/>
               </w:rPr>
-              <w:t>60</w:t>
+              <w:t>100</w:t>
             </w:r>
           </w:p>
         </w:tc>
@@ -771,7 +771,7 @@
                 <w:b w:val="0"/>
                 <w:sz w:val="21"/>
               </w:rPr>
-              <w:t>¥9</w:t>
+              <w:t>¥15</w:t>
             </w:r>
           </w:p>
         </w:tc>
@@ -2025,7 +2025,7 @@
                 <w:b w:val="0"/>
                 <w:sz w:val="21"/>
               </w:rPr>
-              <w:t>microSD 16GB Class10（闪迪/三星等品牌）</w:t>
+              <w:t>microSD 8GB Class10（闪迪/三星；16GB 版 +¥7 可选）</w:t>
             </w:r>
           </w:p>
         </w:tc>
@@ -2065,7 +2065,7 @@
                 <w:b w:val="0"/>
                 <w:sz w:val="21"/>
               </w:rPr>
-              <w:t>¥15</w:t>
+              <w:t>¥8</w:t>
             </w:r>
           </w:p>
         </w:tc>
@@ -2085,7 +2085,7 @@
                 <w:b w:val="0"/>
                 <w:sz w:val="21"/>
               </w:rPr>
-              <w:t>¥15</w:t>
+              <w:t>¥8</w:t>
             </w:r>
           </w:p>
         </w:tc>
@@ -2317,7 +2317,7 @@
                 <w:b w:val="0"/>
                 <w:sz w:val="21"/>
               </w:rPr>
-              <w:t>WS2812B RGB LED 灯条（60 珠/m，2×6 珠约 55mm/条）</w:t>
+              <w:t>WS2812B RGB LED 灯条（60 珠/m，2×6 珠约 55mm/条；先购 1 条，另一条可后加）</w:t>
             </w:r>
           </w:p>
         </w:tc>
@@ -2337,7 +2337,7 @@
                 <w:b w:val="0"/>
                 <w:sz w:val="21"/>
               </w:rPr>
-              <w:t>2条</w:t>
+              <w:t>1条</w:t>
             </w:r>
           </w:p>
         </w:tc>
@@ -2377,7 +2377,7 @@
                 <w:b w:val="0"/>
                 <w:sz w:val="21"/>
               </w:rPr>
-              <w:t>¥10</w:t>
+              <w:t>¥5</w:t>
             </w:r>
           </w:p>
         </w:tc>
@@ -2569,298 +2569,6 @@
                 <w:b w:val="0"/>
                 <w:sz w:val="21"/>
               </w:rPr>
-              <w:t>14</w:t>
-            </w:r>
-          </w:p>
-        </w:tc>
-        <w:tc>
-          <w:tcPr>
-            <w:tcW w:type="dxa" w:w="1247"/>
-            <w:vAlign w:val="center"/>
-          </w:tcPr>
-          <w:p>
-            <w:pPr>
-              <w:ind w:firstLine="0" w:left="0" w:right="0"/>
-              <w:jc w:val="left"/>
-            </w:pPr>
-            <w:r>
-              <w:rPr>
-                <w:rFonts w:ascii="Times New Roman" w:hAnsi="Times New Roman" w:eastAsia="宋体"/>
-                <w:b w:val="0"/>
-                <w:sz w:val="21"/>
-              </w:rPr>
-              <w:t>电源开关</w:t>
-            </w:r>
-          </w:p>
-        </w:tc>
-        <w:tc>
-          <w:tcPr>
-            <w:tcW w:type="dxa" w:w="3515"/>
-            <w:vAlign w:val="center"/>
-          </w:tcPr>
-          <w:p>
-            <w:pPr>
-              <w:ind w:firstLine="0" w:left="0" w:right="0"/>
-              <w:jc w:val="left"/>
-            </w:pPr>
-            <w:r>
-              <w:rPr>
-                <w:rFonts w:ascii="Times New Roman" w:hAnsi="Times New Roman" w:eastAsia="宋体"/>
-                <w:b w:val="0"/>
-                <w:sz w:val="21"/>
-              </w:rPr>
-              <w:t>SS12D00 拨动开关（19×10×7，柄行程 4mm）</w:t>
-            </w:r>
-          </w:p>
-        </w:tc>
-        <w:tc>
-          <w:tcPr>
-            <w:tcW w:type="dxa" w:w="680"/>
-            <w:vAlign w:val="center"/>
-          </w:tcPr>
-          <w:p>
-            <w:pPr>
-              <w:ind w:firstLine="0" w:left="0" w:right="0"/>
-              <w:jc w:val="center"/>
-            </w:pPr>
-            <w:r>
-              <w:rPr>
-                <w:rFonts w:ascii="Times New Roman" w:hAnsi="Times New Roman" w:eastAsia="宋体"/>
-                <w:b w:val="0"/>
-                <w:sz w:val="21"/>
-              </w:rPr>
-              <w:t>1</w:t>
-            </w:r>
-          </w:p>
-        </w:tc>
-        <w:tc>
-          <w:tcPr>
-            <w:tcW w:type="dxa" w:w="907"/>
-            <w:vAlign w:val="center"/>
-          </w:tcPr>
-          <w:p>
-            <w:pPr>
-              <w:ind w:firstLine="0" w:left="0" w:right="0"/>
-              <w:jc w:val="right"/>
-            </w:pPr>
-            <w:r>
-              <w:rPr>
-                <w:rFonts w:ascii="Times New Roman" w:hAnsi="Times New Roman" w:eastAsia="宋体"/>
-                <w:b w:val="0"/>
-                <w:sz w:val="21"/>
-              </w:rPr>
-              <w:t>¥1</w:t>
-            </w:r>
-          </w:p>
-        </w:tc>
-        <w:tc>
-          <w:tcPr>
-            <w:tcW w:type="dxa" w:w="907"/>
-            <w:vAlign w:val="center"/>
-          </w:tcPr>
-          <w:p>
-            <w:pPr>
-              <w:ind w:firstLine="0" w:left="0" w:right="0"/>
-              <w:jc w:val="right"/>
-            </w:pPr>
-            <w:r>
-              <w:rPr>
-                <w:rFonts w:ascii="Times New Roman" w:hAnsi="Times New Roman" w:eastAsia="宋体"/>
-                <w:b w:val="0"/>
-                <w:sz w:val="21"/>
-              </w:rPr>
-              <w:t>¥1</w:t>
-            </w:r>
-          </w:p>
-        </w:tc>
-        <w:tc>
-          <w:tcPr>
-            <w:tcW w:type="dxa" w:w="1701"/>
-            <w:vAlign w:val="center"/>
-          </w:tcPr>
-          <w:p>
-            <w:pPr>
-              <w:ind w:firstLine="0" w:left="0" w:right="0"/>
-              <w:jc w:val="left"/>
-            </w:pPr>
-            <w:r>
-              <w:rPr>
-                <w:rFonts w:ascii="Times New Roman" w:hAnsi="Times New Roman" w:eastAsia="宋体"/>
-                <w:b w:val="0"/>
-                <w:sz w:val="21"/>
-              </w:rPr>
-              <w:t>SS12D00 拨动开关</w:t>
-            </w:r>
-          </w:p>
-        </w:tc>
-      </w:tr>
-      <w:tr>
-        <w:trPr>
-          <w:tblHeader w:val="true"/>
-          <w:cantSplit w:val="true"/>
-        </w:trPr>
-        <w:tc>
-          <w:tcPr>
-            <w:tcW w:type="dxa" w:w="680"/>
-            <w:vAlign w:val="center"/>
-          </w:tcPr>
-          <w:p>
-            <w:pPr>
-              <w:ind w:firstLine="0" w:left="0" w:right="0"/>
-              <w:jc w:val="center"/>
-            </w:pPr>
-            <w:r>
-              <w:rPr>
-                <w:rFonts w:ascii="Times New Roman" w:hAnsi="Times New Roman" w:eastAsia="宋体"/>
-                <w:b w:val="0"/>
-                <w:sz w:val="21"/>
-              </w:rPr>
-              <w:t>15</w:t>
-            </w:r>
-          </w:p>
-        </w:tc>
-        <w:tc>
-          <w:tcPr>
-            <w:tcW w:type="dxa" w:w="1247"/>
-            <w:vAlign w:val="center"/>
-          </w:tcPr>
-          <w:p>
-            <w:pPr>
-              <w:ind w:firstLine="0" w:left="0" w:right="0"/>
-              <w:jc w:val="left"/>
-            </w:pPr>
-            <w:r>
-              <w:rPr>
-                <w:rFonts w:ascii="Times New Roman" w:hAnsi="Times New Roman" w:eastAsia="宋体"/>
-                <w:b w:val="0"/>
-                <w:sz w:val="21"/>
-              </w:rPr>
-              <w:t>音量侧键</w:t>
-            </w:r>
-          </w:p>
-        </w:tc>
-        <w:tc>
-          <w:tcPr>
-            <w:tcW w:type="dxa" w:w="3515"/>
-            <w:vAlign w:val="center"/>
-          </w:tcPr>
-          <w:p>
-            <w:pPr>
-              <w:ind w:firstLine="0" w:left="0" w:right="0"/>
-              <w:jc w:val="left"/>
-            </w:pPr>
-            <w:r>
-              <w:rPr>
-                <w:rFonts w:ascii="Times New Roman" w:hAnsi="Times New Roman" w:eastAsia="宋体"/>
-                <w:b w:val="0"/>
-                <w:sz w:val="21"/>
-              </w:rPr>
-              <w:t>轻触键 2 个（从 60 键余量取，或另买 6×6 立式）</w:t>
-            </w:r>
-          </w:p>
-        </w:tc>
-        <w:tc>
-          <w:tcPr>
-            <w:tcW w:type="dxa" w:w="680"/>
-            <w:vAlign w:val="center"/>
-          </w:tcPr>
-          <w:p>
-            <w:pPr>
-              <w:ind w:firstLine="0" w:left="0" w:right="0"/>
-              <w:jc w:val="center"/>
-            </w:pPr>
-            <w:r>
-              <w:rPr>
-                <w:rFonts w:ascii="Times New Roman" w:hAnsi="Times New Roman" w:eastAsia="宋体"/>
-                <w:b w:val="0"/>
-                <w:sz w:val="21"/>
-              </w:rPr>
-              <w:t>2</w:t>
-            </w:r>
-          </w:p>
-        </w:tc>
-        <w:tc>
-          <w:tcPr>
-            <w:tcW w:type="dxa" w:w="907"/>
-            <w:vAlign w:val="center"/>
-          </w:tcPr>
-          <w:p>
-            <w:pPr>
-              <w:ind w:firstLine="0" w:left="0" w:right="0"/>
-              <w:jc w:val="right"/>
-            </w:pPr>
-            <w:r>
-              <w:rPr>
-                <w:rFonts w:ascii="Times New Roman" w:hAnsi="Times New Roman" w:eastAsia="宋体"/>
-                <w:b w:val="0"/>
-                <w:sz w:val="21"/>
-              </w:rPr>
-              <w:t>¥0.5</w:t>
-            </w:r>
-          </w:p>
-        </w:tc>
-        <w:tc>
-          <w:tcPr>
-            <w:tcW w:type="dxa" w:w="907"/>
-            <w:vAlign w:val="center"/>
-          </w:tcPr>
-          <w:p>
-            <w:pPr>
-              <w:ind w:firstLine="0" w:left="0" w:right="0"/>
-              <w:jc w:val="right"/>
-            </w:pPr>
-            <w:r>
-              <w:rPr>
-                <w:rFonts w:ascii="Times New Roman" w:hAnsi="Times New Roman" w:eastAsia="宋体"/>
-                <w:b w:val="0"/>
-                <w:sz w:val="21"/>
-              </w:rPr>
-              <w:t>¥1</w:t>
-            </w:r>
-          </w:p>
-        </w:tc>
-        <w:tc>
-          <w:tcPr>
-            <w:tcW w:type="dxa" w:w="1701"/>
-            <w:vAlign w:val="center"/>
-          </w:tcPr>
-          <w:p>
-            <w:pPr>
-              <w:ind w:firstLine="0" w:left="0" w:right="0"/>
-              <w:jc w:val="left"/>
-            </w:pPr>
-            <w:r>
-              <w:rPr>
-                <w:rFonts w:ascii="Times New Roman" w:hAnsi="Times New Roman" w:eastAsia="宋体"/>
-                <w:b w:val="0"/>
-                <w:sz w:val="21"/>
-              </w:rPr>
-              <w:t>轻触开关 6x6 立式</w:t>
-            </w:r>
-          </w:p>
-        </w:tc>
-      </w:tr>
-      <w:tr>
-        <w:trPr>
-          <w:tblHeader w:val="true"/>
-          <w:cantSplit w:val="true"/>
-        </w:trPr>
-        <w:tc>
-          <w:tcPr>
-            <w:tcW w:type="dxa" w:w="680"/>
-            <w:vAlign w:val="center"/>
-          </w:tcPr>
-          <w:p>
-            <w:pPr>
-              <w:ind w:firstLine="0" w:left="0" w:right="0"/>
-              <w:jc w:val="center"/>
-            </w:pPr>
-            <w:r>
-              <w:rPr>
-                <w:rFonts w:ascii="Times New Roman" w:hAnsi="Times New Roman" w:eastAsia="宋体"/>
-                <w:b w:val="0"/>
-                <w:sz w:val="21"/>
-              </w:rPr>
               <w:t>16</w:t>
             </w:r>
           </w:p>
@@ -3007,152 +2715,6 @@
                 <w:b w:val="0"/>
                 <w:sz w:val="21"/>
               </w:rPr>
-              <w:t>17</w:t>
-            </w:r>
-          </w:p>
-        </w:tc>
-        <w:tc>
-          <w:tcPr>
-            <w:tcW w:type="dxa" w:w="1247"/>
-            <w:vAlign w:val="center"/>
-          </w:tcPr>
-          <w:p>
-            <w:pPr>
-              <w:ind w:firstLine="0" w:left="0" w:right="0"/>
-              <w:jc w:val="left"/>
-            </w:pPr>
-            <w:r>
-              <w:rPr>
-                <w:rFonts w:ascii="Times New Roman" w:hAnsi="Times New Roman" w:eastAsia="宋体"/>
-                <w:b w:val="0"/>
-                <w:sz w:val="21"/>
-              </w:rPr>
-              <w:t>外壳</w:t>
-            </w:r>
-          </w:p>
-        </w:tc>
-        <w:tc>
-          <w:tcPr>
-            <w:tcW w:type="dxa" w:w="3515"/>
-            <w:vAlign w:val="center"/>
-          </w:tcPr>
-          <w:p>
-            <w:pPr>
-              <w:ind w:firstLine="0" w:left="0" w:right="0"/>
-              <w:jc w:val="left"/>
-            </w:pPr>
-            <w:r>
-              <w:rPr>
-                <w:rFonts w:ascii="Times New Roman" w:hAnsi="Times New Roman" w:eastAsia="宋体"/>
-                <w:b w:val="0"/>
-                <w:sz w:val="21"/>
-              </w:rPr>
-              <w:t>3D 打印 107×157×20（顶盖 2.5 + 壳体 17.5 两件）</w:t>
-            </w:r>
-          </w:p>
-        </w:tc>
-        <w:tc>
-          <w:tcPr>
-            <w:tcW w:type="dxa" w:w="680"/>
-            <w:vAlign w:val="center"/>
-          </w:tcPr>
-          <w:p>
-            <w:pPr>
-              <w:ind w:firstLine="0" w:left="0" w:right="0"/>
-              <w:jc w:val="center"/>
-            </w:pPr>
-            <w:r>
-              <w:rPr>
-                <w:rFonts w:ascii="Times New Roman" w:hAnsi="Times New Roman" w:eastAsia="宋体"/>
-                <w:b w:val="0"/>
-                <w:sz w:val="21"/>
-              </w:rPr>
-              <w:t>1套</w:t>
-            </w:r>
-          </w:p>
-        </w:tc>
-        <w:tc>
-          <w:tcPr>
-            <w:tcW w:type="dxa" w:w="907"/>
-            <w:vAlign w:val="center"/>
-          </w:tcPr>
-          <w:p>
-            <w:pPr>
-              <w:ind w:firstLine="0" w:left="0" w:right="0"/>
-              <w:jc w:val="right"/>
-            </w:pPr>
-            <w:r>
-              <w:rPr>
-                <w:rFonts w:ascii="Times New Roman" w:hAnsi="Times New Roman" w:eastAsia="宋体"/>
-                <w:b w:val="0"/>
-                <w:sz w:val="21"/>
-              </w:rPr>
-              <w:t>¥50</w:t>
-            </w:r>
-          </w:p>
-        </w:tc>
-        <w:tc>
-          <w:tcPr>
-            <w:tcW w:type="dxa" w:w="907"/>
-            <w:vAlign w:val="center"/>
-          </w:tcPr>
-          <w:p>
-            <w:pPr>
-              <w:ind w:firstLine="0" w:left="0" w:right="0"/>
-              <w:jc w:val="right"/>
-            </w:pPr>
-            <w:r>
-              <w:rPr>
-                <w:rFonts w:ascii="Times New Roman" w:hAnsi="Times New Roman" w:eastAsia="宋体"/>
-                <w:b w:val="0"/>
-                <w:sz w:val="21"/>
-              </w:rPr>
-              <w:t>¥50</w:t>
-            </w:r>
-          </w:p>
-        </w:tc>
-        <w:tc>
-          <w:tcPr>
-            <w:tcW w:type="dxa" w:w="1701"/>
-            <w:vAlign w:val="center"/>
-          </w:tcPr>
-          <w:p>
-            <w:pPr>
-              <w:ind w:firstLine="0" w:left="0" w:right="0"/>
-              <w:jc w:val="left"/>
-            </w:pPr>
-            <w:r>
-              <w:rPr>
-                <w:rFonts w:ascii="Times New Roman" w:hAnsi="Times New Roman" w:eastAsia="宋体"/>
-                <w:b w:val="0"/>
-                <w:sz w:val="21"/>
-              </w:rPr>
-              <w:t>3D打印 代打印 PLA</w:t>
-            </w:r>
-          </w:p>
-        </w:tc>
-      </w:tr>
-      <w:tr>
-        <w:trPr>
-          <w:tblHeader w:val="true"/>
-          <w:cantSplit w:val="true"/>
-        </w:trPr>
-        <w:tc>
-          <w:tcPr>
-            <w:tcW w:type="dxa" w:w="680"/>
-            <w:vAlign w:val="center"/>
-          </w:tcPr>
-          <w:p>
-            <w:pPr>
-              <w:ind w:firstLine="0" w:left="0" w:right="0"/>
-              <w:jc w:val="center"/>
-            </w:pPr>
-            <w:r>
-              <w:rPr>
-                <w:rFonts w:ascii="Times New Roman" w:hAnsi="Times New Roman" w:eastAsia="宋体"/>
-                <w:b w:val="0"/>
-                <w:sz w:val="21"/>
-              </w:rPr>
               <w:t>18</w:t>
             </w:r>
           </w:p>
@@ -3213,7 +2775,7 @@
                 <w:b w:val="0"/>
                 <w:sz w:val="21"/>
               </w:rPr>
-              <w:t>2</w:t>
+              <w:t>1</w:t>
             </w:r>
           </w:p>
         </w:tc>
@@ -3253,7 +2815,7 @@
                 <w:b w:val="0"/>
                 <w:sz w:val="21"/>
               </w:rPr>
-              <w:t>¥10</w:t>
+              <w:t>¥5</w:t>
             </w:r>
           </w:p>
         </w:tc>
@@ -3274,6 +2836,590 @@
                 <w:sz w:val="21"/>
               </w:rPr>
               <w:t>面包板 830孔 中号</w:t>
+            </w:r>
+          </w:p>
+        </w:tc>
+      </w:tr>
+      <w:tr>
+        <w:trPr>
+          <w:tblHeader w:val="true"/>
+          <w:cantSplit w:val="true"/>
+        </w:trPr>
+        <w:tc>
+          <w:tcPr>
+            <w:tcW w:type="dxa" w:w="680"/>
+            <w:vAlign w:val="center"/>
+          </w:tcPr>
+          <w:p>
+            <w:pPr>
+              <w:ind w:firstLine="0" w:left="0" w:right="0"/>
+              <w:jc w:val="center"/>
+            </w:pPr>
+            <w:r>
+              <w:rPr>
+                <w:rFonts w:ascii="Times New Roman" w:hAnsi="Times New Roman" w:eastAsia="宋体"/>
+                <w:b w:val="0"/>
+                <w:sz w:val="21"/>
+              </w:rPr>
+              <w:t>18b</w:t>
+            </w:r>
+          </w:p>
+        </w:tc>
+        <w:tc>
+          <w:tcPr>
+            <w:tcW w:type="dxa" w:w="1247"/>
+            <w:vAlign w:val="center"/>
+          </w:tcPr>
+          <w:p>
+            <w:pPr>
+              <w:ind w:firstLine="0" w:left="0" w:right="0"/>
+              <w:jc w:val="left"/>
+            </w:pPr>
+            <w:r>
+              <w:rPr>
+                <w:rFonts w:ascii="Times New Roman" w:hAnsi="Times New Roman" w:eastAsia="宋体"/>
+                <w:b w:val="0"/>
+                <w:sz w:val="21"/>
+              </w:rPr>
+              <w:t>直焊漆包线</w:t>
+            </w:r>
+          </w:p>
+        </w:tc>
+        <w:tc>
+          <w:tcPr>
+            <w:tcW w:type="dxa" w:w="3515"/>
+            <w:vAlign w:val="center"/>
+          </w:tcPr>
+          <w:p>
+            <w:pPr>
+              <w:ind w:firstLine="0" w:left="0" w:right="0"/>
+              <w:jc w:val="left"/>
+            </w:pPr>
+            <w:r>
+              <w:rPr>
+                <w:rFonts w:ascii="Times New Roman" w:hAnsi="Times New Roman" w:eastAsia="宋体"/>
+                <w:b w:val="0"/>
+                <w:sz w:val="21"/>
+              </w:rPr>
+              <w:t>免刮漆包线 0.3~0.5mm（聚氨酯可焊漆，洞洞板飞线不短路）</w:t>
+            </w:r>
+          </w:p>
+        </w:tc>
+        <w:tc>
+          <w:tcPr>
+            <w:tcW w:type="dxa" w:w="680"/>
+            <w:vAlign w:val="center"/>
+          </w:tcPr>
+          <w:p>
+            <w:pPr>
+              <w:ind w:firstLine="0" w:left="0" w:right="0"/>
+              <w:jc w:val="center"/>
+            </w:pPr>
+            <w:r>
+              <w:rPr>
+                <w:rFonts w:ascii="Times New Roman" w:hAnsi="Times New Roman" w:eastAsia="宋体"/>
+                <w:b w:val="0"/>
+                <w:sz w:val="21"/>
+              </w:rPr>
+              <w:t>1卷</w:t>
+            </w:r>
+          </w:p>
+        </w:tc>
+        <w:tc>
+          <w:tcPr>
+            <w:tcW w:type="dxa" w:w="907"/>
+            <w:vAlign w:val="center"/>
+          </w:tcPr>
+          <w:p>
+            <w:pPr>
+              <w:ind w:firstLine="0" w:left="0" w:right="0"/>
+              <w:jc w:val="right"/>
+            </w:pPr>
+            <w:r>
+              <w:rPr>
+                <w:rFonts w:ascii="Times New Roman" w:hAnsi="Times New Roman" w:eastAsia="宋体"/>
+                <w:b w:val="0"/>
+                <w:sz w:val="21"/>
+              </w:rPr>
+              <w:t>¥5</w:t>
+            </w:r>
+          </w:p>
+        </w:tc>
+        <w:tc>
+          <w:tcPr>
+            <w:tcW w:type="dxa" w:w="907"/>
+            <w:vAlign w:val="center"/>
+          </w:tcPr>
+          <w:p>
+            <w:pPr>
+              <w:ind w:firstLine="0" w:left="0" w:right="0"/>
+              <w:jc w:val="right"/>
+            </w:pPr>
+            <w:r>
+              <w:rPr>
+                <w:rFonts w:ascii="Times New Roman" w:hAnsi="Times New Roman" w:eastAsia="宋体"/>
+                <w:b w:val="0"/>
+                <w:sz w:val="21"/>
+              </w:rPr>
+              <w:t>¥5</w:t>
+            </w:r>
+          </w:p>
+        </w:tc>
+        <w:tc>
+          <w:tcPr>
+            <w:tcW w:type="dxa" w:w="1701"/>
+            <w:vAlign w:val="center"/>
+          </w:tcPr>
+          <w:p>
+            <w:pPr>
+              <w:ind w:firstLine="0" w:left="0" w:right="0"/>
+              <w:jc w:val="left"/>
+            </w:pPr>
+            <w:r>
+              <w:rPr>
+                <w:rFonts w:ascii="Times New Roman" w:hAnsi="Times New Roman" w:eastAsia="宋体"/>
+                <w:b w:val="0"/>
+                <w:sz w:val="21"/>
+              </w:rPr>
+              <w:t>直焊漆包线</w:t>
+            </w:r>
+          </w:p>
+        </w:tc>
+      </w:tr>
+      <w:tr>
+        <w:trPr>
+          <w:tblHeader w:val="true"/>
+          <w:cantSplit w:val="true"/>
+        </w:trPr>
+        <w:tc>
+          <w:tcPr>
+            <w:tcW w:type="dxa" w:w="680"/>
+            <w:vAlign w:val="center"/>
+          </w:tcPr>
+          <w:p>
+            <w:pPr>
+              <w:ind w:firstLine="0" w:left="0" w:right="0"/>
+              <w:jc w:val="center"/>
+            </w:pPr>
+            <w:r>
+              <w:rPr>
+                <w:rFonts w:ascii="Times New Roman" w:hAnsi="Times New Roman" w:eastAsia="宋体"/>
+                <w:b w:val="0"/>
+                <w:sz w:val="21"/>
+              </w:rPr>
+              <w:t>备1</w:t>
+            </w:r>
+          </w:p>
+        </w:tc>
+        <w:tc>
+          <w:tcPr>
+            <w:tcW w:type="dxa" w:w="1247"/>
+            <w:vAlign w:val="center"/>
+          </w:tcPr>
+          <w:p>
+            <w:pPr>
+              <w:ind w:firstLine="0" w:left="0" w:right="0"/>
+              <w:jc w:val="left"/>
+            </w:pPr>
+            <w:r>
+              <w:rPr>
+                <w:rFonts w:ascii="Times New Roman" w:hAnsi="Times New Roman" w:eastAsia="宋体"/>
+                <w:b w:val="0"/>
+                <w:sz w:val="21"/>
+              </w:rPr>
+              <w:t>MCP23017 备用</w:t>
+            </w:r>
+          </w:p>
+        </w:tc>
+        <w:tc>
+          <w:tcPr>
+            <w:tcW w:type="dxa" w:w="3515"/>
+            <w:vAlign w:val="center"/>
+          </w:tcPr>
+          <w:p>
+            <w:pPr>
+              <w:ind w:firstLine="0" w:left="0" w:right="0"/>
+              <w:jc w:val="left"/>
+            </w:pPr>
+            <w:r>
+              <w:rPr>
+                <w:rFonts w:ascii="Times New Roman" w:hAnsi="Times New Roman" w:eastAsia="宋体"/>
+                <w:b w:val="0"/>
+                <w:sz w:val="21"/>
+              </w:rPr>
+              <w:t>MCP23017-I/SP（DIP-28，焊坏/插反烧毁替换件）</w:t>
+            </w:r>
+          </w:p>
+        </w:tc>
+        <w:tc>
+          <w:tcPr>
+            <w:tcW w:type="dxa" w:w="680"/>
+            <w:vAlign w:val="center"/>
+          </w:tcPr>
+          <w:p>
+            <w:pPr>
+              <w:ind w:firstLine="0" w:left="0" w:right="0"/>
+              <w:jc w:val="center"/>
+            </w:pPr>
+            <w:r>
+              <w:rPr>
+                <w:rFonts w:ascii="Times New Roman" w:hAnsi="Times New Roman" w:eastAsia="宋体"/>
+                <w:b w:val="0"/>
+                <w:sz w:val="21"/>
+              </w:rPr>
+              <w:t>1</w:t>
+            </w:r>
+          </w:p>
+        </w:tc>
+        <w:tc>
+          <w:tcPr>
+            <w:tcW w:type="dxa" w:w="907"/>
+            <w:vAlign w:val="center"/>
+          </w:tcPr>
+          <w:p>
+            <w:pPr>
+              <w:ind w:firstLine="0" w:left="0" w:right="0"/>
+              <w:jc w:val="right"/>
+            </w:pPr>
+            <w:r>
+              <w:rPr>
+                <w:rFonts w:ascii="Times New Roman" w:hAnsi="Times New Roman" w:eastAsia="宋体"/>
+                <w:b w:val="0"/>
+                <w:sz w:val="21"/>
+              </w:rPr>
+              <w:t>¥5</w:t>
+            </w:r>
+          </w:p>
+        </w:tc>
+        <w:tc>
+          <w:tcPr>
+            <w:tcW w:type="dxa" w:w="907"/>
+            <w:vAlign w:val="center"/>
+          </w:tcPr>
+          <w:p>
+            <w:pPr>
+              <w:ind w:firstLine="0" w:left="0" w:right="0"/>
+              <w:jc w:val="right"/>
+            </w:pPr>
+            <w:r>
+              <w:rPr>
+                <w:rFonts w:ascii="Times New Roman" w:hAnsi="Times New Roman" w:eastAsia="宋体"/>
+                <w:b w:val="0"/>
+                <w:sz w:val="21"/>
+              </w:rPr>
+              <w:t>¥5</w:t>
+            </w:r>
+          </w:p>
+        </w:tc>
+        <w:tc>
+          <w:tcPr>
+            <w:tcW w:type="dxa" w:w="1701"/>
+            <w:vAlign w:val="center"/>
+          </w:tcPr>
+          <w:p>
+            <w:pPr>
+              <w:ind w:firstLine="0" w:left="0" w:right="0"/>
+              <w:jc w:val="left"/>
+            </w:pPr>
+            <w:r>
+              <w:rPr>
+                <w:rFonts w:ascii="Times New Roman" w:hAnsi="Times New Roman" w:eastAsia="宋体"/>
+                <w:b w:val="0"/>
+                <w:sz w:val="21"/>
+              </w:rPr>
+              <w:t>MCP23017 DIP 直插</w:t>
+            </w:r>
+          </w:p>
+        </w:tc>
+      </w:tr>
+      <w:tr>
+        <w:trPr>
+          <w:tblHeader w:val="true"/>
+          <w:cantSplit w:val="true"/>
+        </w:trPr>
+        <w:tc>
+          <w:tcPr>
+            <w:tcW w:type="dxa" w:w="680"/>
+            <w:vAlign w:val="center"/>
+          </w:tcPr>
+          <w:p>
+            <w:pPr>
+              <w:ind w:firstLine="0" w:left="0" w:right="0"/>
+              <w:jc w:val="center"/>
+            </w:pPr>
+            <w:r>
+              <w:rPr>
+                <w:rFonts w:ascii="Times New Roman" w:hAnsi="Times New Roman" w:eastAsia="宋体"/>
+                <w:b w:val="0"/>
+                <w:sz w:val="21"/>
+              </w:rPr>
+              <w:t>备2</w:t>
+            </w:r>
+          </w:p>
+        </w:tc>
+        <w:tc>
+          <w:tcPr>
+            <w:tcW w:type="dxa" w:w="1247"/>
+            <w:vAlign w:val="center"/>
+          </w:tcPr>
+          <w:p>
+            <w:pPr>
+              <w:ind w:firstLine="0" w:left="0" w:right="0"/>
+              <w:jc w:val="left"/>
+            </w:pPr>
+            <w:r>
+              <w:rPr>
+                <w:rFonts w:ascii="Times New Roman" w:hAnsi="Times New Roman" w:eastAsia="宋体"/>
+                <w:b w:val="0"/>
+                <w:sz w:val="21"/>
+              </w:rPr>
+              <w:t>功放 备用</w:t>
+            </w:r>
+          </w:p>
+        </w:tc>
+        <w:tc>
+          <w:tcPr>
+            <w:tcW w:type="dxa" w:w="3515"/>
+            <w:vAlign w:val="center"/>
+          </w:tcPr>
+          <w:p>
+            <w:pPr>
+              <w:ind w:firstLine="0" w:left="0" w:right="0"/>
+              <w:jc w:val="left"/>
+            </w:pPr>
+            <w:r>
+              <w:rPr>
+                <w:rFonts w:ascii="Times New Roman" w:hAnsi="Times New Roman" w:eastAsia="宋体"/>
+                <w:b w:val="0"/>
+                <w:sz w:val="21"/>
+              </w:rPr>
+              <w:t>MAX98357A 模块（接错电源易烧，替换件）</w:t>
+            </w:r>
+          </w:p>
+        </w:tc>
+        <w:tc>
+          <w:tcPr>
+            <w:tcW w:type="dxa" w:w="680"/>
+            <w:vAlign w:val="center"/>
+          </w:tcPr>
+          <w:p>
+            <w:pPr>
+              <w:ind w:firstLine="0" w:left="0" w:right="0"/>
+              <w:jc w:val="center"/>
+            </w:pPr>
+            <w:r>
+              <w:rPr>
+                <w:rFonts w:ascii="Times New Roman" w:hAnsi="Times New Roman" w:eastAsia="宋体"/>
+                <w:b w:val="0"/>
+                <w:sz w:val="21"/>
+              </w:rPr>
+              <w:t>1</w:t>
+            </w:r>
+          </w:p>
+        </w:tc>
+        <w:tc>
+          <w:tcPr>
+            <w:tcW w:type="dxa" w:w="907"/>
+            <w:vAlign w:val="center"/>
+          </w:tcPr>
+          <w:p>
+            <w:pPr>
+              <w:ind w:firstLine="0" w:left="0" w:right="0"/>
+              <w:jc w:val="right"/>
+            </w:pPr>
+            <w:r>
+              <w:rPr>
+                <w:rFonts w:ascii="Times New Roman" w:hAnsi="Times New Roman" w:eastAsia="宋体"/>
+                <w:b w:val="0"/>
+                <w:sz w:val="21"/>
+              </w:rPr>
+              <w:t>¥6</w:t>
+            </w:r>
+          </w:p>
+        </w:tc>
+        <w:tc>
+          <w:tcPr>
+            <w:tcW w:type="dxa" w:w="907"/>
+            <w:vAlign w:val="center"/>
+          </w:tcPr>
+          <w:p>
+            <w:pPr>
+              <w:ind w:firstLine="0" w:left="0" w:right="0"/>
+              <w:jc w:val="right"/>
+            </w:pPr>
+            <w:r>
+              <w:rPr>
+                <w:rFonts w:ascii="Times New Roman" w:hAnsi="Times New Roman" w:eastAsia="宋体"/>
+                <w:b w:val="0"/>
+                <w:sz w:val="21"/>
+              </w:rPr>
+              <w:t>¥6</w:t>
+            </w:r>
+          </w:p>
+        </w:tc>
+        <w:tc>
+          <w:tcPr>
+            <w:tcW w:type="dxa" w:w="1701"/>
+            <w:vAlign w:val="center"/>
+          </w:tcPr>
+          <w:p>
+            <w:pPr>
+              <w:ind w:firstLine="0" w:left="0" w:right="0"/>
+              <w:jc w:val="left"/>
+            </w:pPr>
+            <w:r>
+              <w:rPr>
+                <w:rFonts w:ascii="Times New Roman" w:hAnsi="Times New Roman" w:eastAsia="宋体"/>
+                <w:b w:val="0"/>
+                <w:sz w:val="21"/>
+              </w:rPr>
+              <w:t>MAX98357A 功放模块</w:t>
+            </w:r>
+          </w:p>
+        </w:tc>
+      </w:tr>
+      <w:tr>
+        <w:trPr>
+          <w:tblHeader w:val="true"/>
+          <w:cantSplit w:val="true"/>
+        </w:trPr>
+        <w:tc>
+          <w:tcPr>
+            <w:tcW w:type="dxa" w:w="680"/>
+            <w:vAlign w:val="center"/>
+          </w:tcPr>
+          <w:p>
+            <w:pPr>
+              <w:ind w:firstLine="0" w:left="0" w:right="0"/>
+              <w:jc w:val="center"/>
+            </w:pPr>
+            <w:r>
+              <w:rPr>
+                <w:rFonts w:ascii="Times New Roman" w:hAnsi="Times New Roman" w:eastAsia="宋体"/>
+                <w:b w:val="0"/>
+                <w:sz w:val="21"/>
+              </w:rPr>
+              <w:t>备3</w:t>
+            </w:r>
+          </w:p>
+        </w:tc>
+        <w:tc>
+          <w:tcPr>
+            <w:tcW w:type="dxa" w:w="1247"/>
+            <w:vAlign w:val="center"/>
+          </w:tcPr>
+          <w:p>
+            <w:pPr>
+              <w:ind w:firstLine="0" w:left="0" w:right="0"/>
+              <w:jc w:val="left"/>
+            </w:pPr>
+            <w:r>
+              <w:rPr>
+                <w:rFonts w:ascii="Times New Roman" w:hAnsi="Times New Roman" w:eastAsia="宋体"/>
+                <w:b w:val="0"/>
+                <w:sz w:val="21"/>
+              </w:rPr>
+              <w:t>喇叭 备用</w:t>
+            </w:r>
+          </w:p>
+        </w:tc>
+        <w:tc>
+          <w:tcPr>
+            <w:tcW w:type="dxa" w:w="3515"/>
+            <w:vAlign w:val="center"/>
+          </w:tcPr>
+          <w:p>
+            <w:pPr>
+              <w:ind w:firstLine="0" w:left="0" w:right="0"/>
+              <w:jc w:val="left"/>
+            </w:pPr>
+            <w:r>
+              <w:rPr>
+                <w:rFonts w:ascii="Times New Roman" w:hAnsi="Times New Roman" w:eastAsia="宋体"/>
+                <w:b w:val="0"/>
+                <w:sz w:val="21"/>
+              </w:rPr>
+              <w:t>方形纸盆 4Ω 3W（音圈易焊坏，替换件）</w:t>
+            </w:r>
+          </w:p>
+        </w:tc>
+        <w:tc>
+          <w:tcPr>
+            <w:tcW w:type="dxa" w:w="680"/>
+            <w:vAlign w:val="center"/>
+          </w:tcPr>
+          <w:p>
+            <w:pPr>
+              <w:ind w:firstLine="0" w:left="0" w:right="0"/>
+              <w:jc w:val="center"/>
+            </w:pPr>
+            <w:r>
+              <w:rPr>
+                <w:rFonts w:ascii="Times New Roman" w:hAnsi="Times New Roman" w:eastAsia="宋体"/>
+                <w:b w:val="0"/>
+                <w:sz w:val="21"/>
+              </w:rPr>
+              <w:t>1</w:t>
+            </w:r>
+          </w:p>
+        </w:tc>
+        <w:tc>
+          <w:tcPr>
+            <w:tcW w:type="dxa" w:w="907"/>
+            <w:vAlign w:val="center"/>
+          </w:tcPr>
+          <w:p>
+            <w:pPr>
+              <w:ind w:firstLine="0" w:left="0" w:right="0"/>
+              <w:jc w:val="right"/>
+            </w:pPr>
+            <w:r>
+              <w:rPr>
+                <w:rFonts w:ascii="Times New Roman" w:hAnsi="Times New Roman" w:eastAsia="宋体"/>
+                <w:b w:val="0"/>
+                <w:sz w:val="21"/>
+              </w:rPr>
+              <w:t>¥4</w:t>
+            </w:r>
+          </w:p>
+        </w:tc>
+        <w:tc>
+          <w:tcPr>
+            <w:tcW w:type="dxa" w:w="907"/>
+            <w:vAlign w:val="center"/>
+          </w:tcPr>
+          <w:p>
+            <w:pPr>
+              <w:ind w:firstLine="0" w:left="0" w:right="0"/>
+              <w:jc w:val="right"/>
+            </w:pPr>
+            <w:r>
+              <w:rPr>
+                <w:rFonts w:ascii="Times New Roman" w:hAnsi="Times New Roman" w:eastAsia="宋体"/>
+                <w:b w:val="0"/>
+                <w:sz w:val="21"/>
+              </w:rPr>
+              <w:t>¥4</w:t>
+            </w:r>
+          </w:p>
+        </w:tc>
+        <w:tc>
+          <w:tcPr>
+            <w:tcW w:type="dxa" w:w="1701"/>
+            <w:vAlign w:val="center"/>
+          </w:tcPr>
+          <w:p>
+            <w:pPr>
+              <w:ind w:firstLine="0" w:left="0" w:right="0"/>
+              <w:jc w:val="left"/>
+            </w:pPr>
+            <w:r>
+              <w:rPr>
+                <w:rFonts w:ascii="Times New Roman" w:hAnsi="Times New Roman" w:eastAsia="宋体"/>
+                <w:b w:val="0"/>
+                <w:sz w:val="21"/>
+              </w:rPr>
+              <w:t>喇叭 4欧 3W 方形纸盆</w:t>
             </w:r>
           </w:p>
         </w:tc>
@@ -3338,7 +3484,7 @@
                 <w:b w:val="0"/>
                 <w:sz w:val="21"/>
               </w:rPr>
-              <w:t>（不含外壳 ¥195）</w:t>
+              <w:t>（第一阶段：含备件，不含外壳；外壳 ¥50 后置）</w:t>
             </w:r>
           </w:p>
         </w:tc>
@@ -3396,7 +3542,7 @@
                 <w:b w:val="0"/>
                 <w:sz w:val="21"/>
               </w:rPr>
-              <w:t>≈¥245</w:t>
+              <w:t>≈¥200</w:t>
             </w:r>
           </w:p>
         </w:tc>
@@ -3570,7 +3716,7 @@
         <w:ind w:firstLine="480"/>
       </w:pPr>
       <w:r>
-        <w:t>10. 焊接顺序：先电源与地，再屏幕与摇杆，最后键盘（2× MCP23017 + 60 键，焊完逐行测试再封壳）。</w:t>
+        <w:t>10. 焊接顺序：先电源与地，再屏幕与摇杆，最后键盘（2× MCP23017 + 100 键 60 上板，焊完逐行测试再封壳）。</w:t>
       </w:r>
     </w:p>
     <w:p>
@@ -3652,7 +3798,7 @@
                 <w:b/>
                 <w:sz w:val="21"/>
               </w:rPr>
-              <w:t>合计（含外壳）</w:t>
+              <w:t>第一阶段（含备件）</w:t>
             </w:r>
           </w:p>
         </w:tc>
@@ -3673,7 +3819,7 @@
                 <w:b/>
                 <w:sz w:val="21"/>
               </w:rPr>
-              <w:t>不含外壳</w:t>
+              <w:t>加购外壳后</w:t>
             </w:r>
           </w:p>
         </w:tc>
@@ -3740,7 +3886,7 @@
                 <w:b w:val="0"/>
                 <w:sz w:val="21"/>
               </w:rPr>
-              <w:t>约 ¥185</w:t>
+              <w:t>约 ¥150</w:t>
             </w:r>
           </w:p>
         </w:tc>
@@ -3760,7 +3906,7 @@
                 <w:b w:val="0"/>
                 <w:sz w:val="21"/>
               </w:rPr>
-              <w:t>约 ¥140</w:t>
+              <w:t>约 ¥200</w:t>
             </w:r>
           </w:p>
         </w:tc>
@@ -3826,7 +3972,7 @@
                 <w:b w:val="0"/>
                 <w:sz w:val="21"/>
               </w:rPr>
-              <w:t>约 ¥245</w:t>
+              <w:t>约 ¥200</w:t>
             </w:r>
           </w:p>
         </w:tc>
@@ -3846,7 +3992,7 @@
                 <w:b w:val="0"/>
                 <w:sz w:val="21"/>
               </w:rPr>
-              <w:t>约 ¥195</w:t>
+              <w:t>约 ¥250</w:t>
             </w:r>
           </w:p>
         </w:tc>
@@ -3912,7 +4058,7 @@
                 <w:b w:val="0"/>
                 <w:sz w:val="21"/>
               </w:rPr>
-              <w:t>约 ¥295</w:t>
+              <w:t>约 ¥240</w:t>
             </w:r>
           </w:p>
         </w:tc>
@@ -3932,7 +4078,7 @@
                 <w:b w:val="0"/>
                 <w:sz w:val="21"/>
               </w:rPr>
-              <w:t>约 ¥235</w:t>
+              <w:t>约 ¥290</w:t>
             </w:r>
           </w:p>
         </w:tc>
@@ -4228,7 +4374,7 @@
                 <w:b w:val="0"/>
                 <w:sz w:val="21"/>
               </w:rPr>
-              <w:t>¥30</w:t>
+              <w:t>¥28</w:t>
             </w:r>
           </w:p>
         </w:tc>
@@ -4360,7 +4506,7 @@
                 <w:b w:val="0"/>
                 <w:sz w:val="21"/>
               </w:rPr>
-              <w:t>TF 卡 16GB</w:t>
+              <w:t>TF 卡 8GB（16GB 加 ¥7）</w:t>
             </w:r>
           </w:p>
         </w:tc>
@@ -4380,7 +4526,7 @@
                 <w:b w:val="0"/>
                 <w:sz w:val="21"/>
               </w:rPr>
-              <w:t>¥12</w:t>
+              <w:t>¥6</w:t>
             </w:r>
           </w:p>
         </w:tc>
@@ -4400,7 +4546,7 @@
                 <w:b w:val="0"/>
                 <w:sz w:val="21"/>
               </w:rPr>
-              <w:t>¥15</w:t>
+              <w:t>¥8</w:t>
             </w:r>
           </w:p>
         </w:tc>
@@ -4420,7 +4566,7 @@
                 <w:b w:val="0"/>
                 <w:sz w:val="21"/>
               </w:rPr>
-              <w:t>¥22（闪迪正品）</w:t>
+              <w:t>¥12</w:t>
             </w:r>
           </w:p>
         </w:tc>
@@ -4574,6 +4720,11 @@
       </w:pPr>
       <w:r>
         <w:t>6. 核心板含排针高约 5.5mm，背焊下凸约 7mm。</w:t>
+      </w:r>
+    </w:p>
+    <w:p>
+      <w:r>
+        <w:t>外壳 3D 打印（¥50）后置采购：焊接调试阶段无需外壳，验证通过后再按需下单（见预算对照）。</w:t>
       </w:r>
     </w:p>
     <w:sectPr>

</xml_diff>